<commit_message>
Update CV: Enselia and HR Director
Co-Authored-By: Claude Opus 5.5 <noreply@anthropic.com>
</commit_message>
<xml_diff>
--- a/cv/Richard_Priest_CV.docx
+++ b/cv/Richard_Priest_CV.docx
@@ -498,7 +498,7 @@
           <w:sz w:val="22"/>
           <w:szCs w:val="22"/>
         </w:rPr>
-        <w:t>Principal Technology Consultant (Contract) — Confidential NGO Client</w:t>
+        <w:t>Principal Technology Consultant (Contract) — Enselia</w:t>
       </w:r>
     </w:p>
     <w:p>
@@ -924,7 +924,7 @@
         <w:rPr>
           <w:rFonts w:ascii="Calibri" w:eastAsia="Calibri" w:hAnsi="Calibri" w:cs="Calibri"/>
         </w:rPr>
-        <w:t>Deployed Microsoft 365, consolidated Google Cloud, and led ERP, CPQ, LIMS and OT systems strategy in partnership with the CHRO, CCO and CFO; evaluated and implemented AI tooling to automate data workflows across R&amp;D and commercial functions.</w:t>
+        <w:t>Deployed Microsoft 365, consolidated Google Cloud, and led ERP, CPQ, LIMS and OT systems strategy in partnership with the HR Director, CCO and CFO; evaluated and implemented AI tooling to automate data workflows across R&amp;D and commercial functions.</w:t>
       </w:r>
     </w:p>
     <w:p>

</xml_diff>

<commit_message>
Enselia contract ended September 2026
Co-Authored-By: Claude Opus 5.5 <noreply@anthropic.com>
</commit_message>
<xml_diff>
--- a/cv/Richard_Priest_CV.docx
+++ b/cv/Richard_Priest_CV.docx
@@ -514,101 +514,87 @@
           <w:sz w:val="19"/>
           <w:szCs w:val="19"/>
         </w:rPr>
-        <w:t>July 2026 – Present (13-week contract, inside IR35; charity registration in progress)</w:t>
-      </w:r>
-    </w:p>
-    <w:p>
-      <w:pPr>
-        <w:pStyle w:val="ListParagraph"/>
-        <w:numPr>
-          <w:ilvl w:val="0"/>
-          <w:numId w:val="2"/>
-        </w:numPr>
-        <w:spacing w:after="90"/>
-      </w:pPr>
-      <w:r>
-        <w:rPr>
-          <w:rFonts w:ascii="Calibri" w:eastAsia="Calibri" w:hAnsi="Calibri" w:cs="Calibri"/>
-        </w:rPr>
-        <w:t>Engaged to build the IT function from scratch for an organisation part-way through charity registration, reviewing the existing technology architecture and rolling out improvements as the assignment progresses.</w:t>
-      </w:r>
-    </w:p>
-    <w:p>
-      <w:pPr>
-        <w:pStyle w:val="ListParagraph"/>
-        <w:numPr>
-          <w:ilvl w:val="0"/>
-          <w:numId w:val="2"/>
-        </w:numPr>
-        <w:spacing w:after="90"/>
-      </w:pPr>
-      <w:r>
-        <w:rPr>
-          <w:rFonts w:ascii="Calibri" w:eastAsia="Calibri" w:hAnsi="Calibri" w:cs="Calibri"/>
-        </w:rPr>
-        <w:t xml:space="preserve">Assessing the current managed service provider relationship and the organisation's cybersecurity posture to identify risk and </w:t>
-      </w:r>
-      <w:proofErr w:type="gramStart"/>
-      <w:r>
-        <w:rPr>
-          <w:rFonts w:ascii="Calibri" w:eastAsia="Calibri" w:hAnsi="Calibri" w:cs="Calibri"/>
-        </w:rPr>
-        <w:t>gaps, and</w:t>
-      </w:r>
-      <w:proofErr w:type="gramEnd"/>
-      <w:r>
-        <w:rPr>
-          <w:rFonts w:ascii="Calibri" w:eastAsia="Calibri" w:hAnsi="Calibri" w:cs="Calibri"/>
-        </w:rPr>
-        <w:t xml:space="preserve"> writing IT policy and procedure where none previously existed.</w:t>
-      </w:r>
-    </w:p>
-    <w:p>
-      <w:pPr>
-        <w:pStyle w:val="ListParagraph"/>
-        <w:numPr>
-          <w:ilvl w:val="0"/>
-          <w:numId w:val="2"/>
-        </w:numPr>
-        <w:spacing w:after="90"/>
-      </w:pPr>
-      <w:r>
-        <w:rPr>
-          <w:rFonts w:ascii="Calibri" w:eastAsia="Calibri" w:hAnsi="Calibri" w:cs="Calibri"/>
-        </w:rPr>
-        <w:t>Profiling the current MSP's performance, coverage and value for money to build the case for an RFP, should the board wish to test the market and consider alternative providers.</w:t>
-      </w:r>
-    </w:p>
-    <w:p>
-      <w:pPr>
-        <w:pStyle w:val="ListParagraph"/>
-        <w:numPr>
-          <w:ilvl w:val="0"/>
-          <w:numId w:val="2"/>
-        </w:numPr>
-        <w:spacing w:after="90"/>
-      </w:pPr>
-      <w:r>
-        <w:rPr>
-          <w:rFonts w:ascii="Calibri" w:eastAsia="Calibri" w:hAnsi="Calibri" w:cs="Calibri"/>
-        </w:rPr>
-        <w:t>Established a secure SharePoint client portal for file sharing and advising the board on the future shape, structure and resourcing of the technology function.</w:t>
-      </w:r>
-    </w:p>
-    <w:p>
-      <w:pPr>
-        <w:pStyle w:val="ListParagraph"/>
-        <w:numPr>
-          <w:ilvl w:val="0"/>
-          <w:numId w:val="2"/>
-        </w:numPr>
-        <w:spacing w:after="90"/>
-      </w:pPr>
-      <w:r>
-        <w:rPr>
-          <w:rFonts w:ascii="Calibri" w:eastAsia="Calibri" w:hAnsi="Calibri" w:cs="Calibri"/>
-        </w:rPr>
-        <w:t>Currently in negotiations to reduce Microsoft licensing spend by moving the organisation onto the Microsoft charity licensing arrangement, taking advantage of not-for-profit pricing now that charity registration is progressing.</w:t>
+        <w:t xml:space="preserve">July 2026 – September 2026 (13-week contract, inside IR35)</w:t>
+      </w:r>
+    </w:p>
+    <w:p>
+      <w:pPr>
+        <w:pStyle w:val="ListParagraph"/>
+        <w:numPr>
+          <w:ilvl w:val="0"/>
+          <w:numId w:val="2"/>
+        </w:numPr>
+        <w:spacing w:after="90"/>
+      </w:pPr>
+      <w:r>
+        <w:rPr>
+          <w:rFonts w:ascii="Calibri" w:eastAsia="Calibri" w:hAnsi="Calibri" w:cs="Calibri"/>
+        </w:rPr>
+        <w:t xml:space="preserve">Engaged to build the IT function from scratch for an organisation part-way through charity registration, reviewing the existing technology architecture and rolling out improvements as the assignment progressed.</w:t>
+      </w:r>
+    </w:p>
+    <w:p>
+      <w:pPr>
+        <w:pStyle w:val="ListParagraph"/>
+        <w:numPr>
+          <w:ilvl w:val="0"/>
+          <w:numId w:val="2"/>
+        </w:numPr>
+        <w:spacing w:after="90"/>
+      </w:pPr>
+      <w:r>
+        <w:rPr>
+          <w:rFonts w:ascii="Calibri" w:eastAsia="Calibri" w:hAnsi="Calibri" w:cs="Calibri"/>
+        </w:rPr>
+        <w:t xml:space="preserve">Assessed the managed service provider relationship and the organisation's cybersecurity posture to identify risk and gaps, and wrote IT policy and procedure where none previously existed.</w:t>
+      </w:r>
+    </w:p>
+    <w:p>
+      <w:pPr>
+        <w:pStyle w:val="ListParagraph"/>
+        <w:numPr>
+          <w:ilvl w:val="0"/>
+          <w:numId w:val="2"/>
+        </w:numPr>
+        <w:spacing w:after="90"/>
+      </w:pPr>
+      <w:r>
+        <w:rPr>
+          <w:rFonts w:ascii="Calibri" w:eastAsia="Calibri" w:hAnsi="Calibri" w:cs="Calibri"/>
+        </w:rPr>
+        <w:t xml:space="preserve">Profiled the MSP's performance, coverage and value for money to build the case for an RFP, should the board wish to test the market and consider alternative providers.</w:t>
+      </w:r>
+    </w:p>
+    <w:p>
+      <w:pPr>
+        <w:pStyle w:val="ListParagraph"/>
+        <w:numPr>
+          <w:ilvl w:val="0"/>
+          <w:numId w:val="2"/>
+        </w:numPr>
+        <w:spacing w:after="90"/>
+      </w:pPr>
+      <w:r>
+        <w:rPr>
+          <w:rFonts w:ascii="Calibri" w:eastAsia="Calibri" w:hAnsi="Calibri" w:cs="Calibri"/>
+        </w:rPr>
+        <w:t xml:space="preserve">Established a secure SharePoint client portal for file sharing and advised the board on the future shape, structure and resourcing of the technology function.</w:t>
+      </w:r>
+    </w:p>
+    <w:p>
+      <w:pPr>
+        <w:pStyle w:val="ListParagraph"/>
+        <w:numPr>
+          <w:ilvl w:val="0"/>
+          <w:numId w:val="2"/>
+        </w:numPr>
+        <w:spacing w:after="90"/>
+      </w:pPr>
+      <w:r>
+        <w:rPr>
+          <w:rFonts w:ascii="Calibri" w:eastAsia="Calibri" w:hAnsi="Calibri" w:cs="Calibri"/>
+        </w:rPr>
+        <w:t xml:space="preserve">Led negotiations to reduce Microsoft licensing spend by moving the organisation onto the Microsoft charity licensing arrangement, taking advantage of not-for-profit pricing.</w:t>
       </w:r>
     </w:p>
     <w:p>

</xml_diff>

<commit_message>
Enselia responsibilities, new skills, charity sector, updated CV
Co-Authored-By: Claude Opus 5.5 <noreply@anthropic.com>
</commit_message>
<xml_diff>
--- a/cv/Richard_Priest_CV.docx
+++ b/cv/Richard_Priest_CV.docx
@@ -467,6 +467,86 @@
     </w:p>
     <w:p>
       <w:pPr>
+        <w:pStyle w:val="ListParagraph"/>
+        <w:numPr>
+          <w:ilvl w:val="0"/>
+          <w:numId w:val="2"/>
+        </w:numPr>
+        <w:spacing w:after="90"/>
+      </w:pPr>
+      <w:r>
+        <w:rPr>
+          <w:rFonts w:ascii="Calibri" w:eastAsia="Calibri" w:hAnsi="Calibri" w:cs="Calibri"/>
+        </w:rPr>
+        <w:t xml:space="preserve">Responsible AI Adoption, Principles &amp; Guardrails</w:t>
+      </w:r>
+    </w:p>
+    <w:p>
+      <w:pPr>
+        <w:pStyle w:val="ListParagraph"/>
+        <w:numPr>
+          <w:ilvl w:val="0"/>
+          <w:numId w:val="2"/>
+        </w:numPr>
+        <w:spacing w:after="90"/>
+      </w:pPr>
+      <w:r>
+        <w:rPr>
+          <w:rFonts w:ascii="Calibri" w:eastAsia="Calibri" w:hAnsi="Calibri" w:cs="Calibri"/>
+        </w:rPr>
+        <w:t xml:space="preserve">Technology Roadmaps Linked to Strategy &amp; Operating Model Change</w:t>
+      </w:r>
+    </w:p>
+    <w:p>
+      <w:pPr>
+        <w:pStyle w:val="ListParagraph"/>
+        <w:numPr>
+          <w:ilvl w:val="0"/>
+          <w:numId w:val="2"/>
+        </w:numPr>
+        <w:spacing w:after="90"/>
+      </w:pPr>
+      <w:r>
+        <w:rPr>
+          <w:rFonts w:ascii="Calibri" w:eastAsia="Calibri" w:hAnsi="Calibri" w:cs="Calibri"/>
+        </w:rPr>
+        <w:t xml:space="preserve">Identity &amp; Access Management</w:t>
+      </w:r>
+    </w:p>
+    <w:p>
+      <w:pPr>
+        <w:pStyle w:val="ListParagraph"/>
+        <w:numPr>
+          <w:ilvl w:val="0"/>
+          <w:numId w:val="2"/>
+        </w:numPr>
+        <w:spacing w:after="90"/>
+      </w:pPr>
+      <w:r>
+        <w:rPr>
+          <w:rFonts w:ascii="Calibri" w:eastAsia="Calibri" w:hAnsi="Calibri" w:cs="Calibri"/>
+        </w:rPr>
+        <w:t xml:space="preserve">Digital Skills Development</w:t>
+      </w:r>
+    </w:p>
+    <w:p>
+      <w:pPr>
+        <w:pStyle w:val="ListParagraph"/>
+        <w:numPr>
+          <w:ilvl w:val="0"/>
+          <w:numId w:val="2"/>
+        </w:numPr>
+        <w:spacing w:after="90"/>
+      </w:pPr>
+      <w:r>
+        <w:rPr>
+          <w:rFonts w:ascii="Calibri" w:eastAsia="Calibri" w:hAnsi="Calibri" w:cs="Calibri"/>
+        </w:rPr>
+        <w:t xml:space="preserve">Translating Technology for Non-Technical Leaders</w:t>
+      </w:r>
+    </w:p>
+    <w:p>
+      <w:pPr>
         <w:pBdr>
           <w:bottom w:val="single" w:sz="6" w:space="4" w:color="BFBFBF"/>
         </w:pBdr>
@@ -599,6 +679,86 @@
     </w:p>
     <w:p>
       <w:pPr>
+        <w:pStyle w:val="ListParagraph"/>
+        <w:numPr>
+          <w:ilvl w:val="0"/>
+          <w:numId w:val="2"/>
+        </w:numPr>
+        <w:spacing w:after="90"/>
+      </w:pPr>
+      <w:r>
+        <w:rPr>
+          <w:rFonts w:ascii="Calibri" w:eastAsia="Calibri" w:hAnsi="Calibri" w:cs="Calibri"/>
+        </w:rPr>
+        <w:t xml:space="preserve">Worked closely with the Senior Leadership Group, the Target Operating Model programme team, finance, people and HR, operations and external technology partners, so that technology was treated as an organisational enabler rather than a back-office cost.</w:t>
+      </w:r>
+    </w:p>
+    <w:p>
+      <w:pPr>
+        <w:pStyle w:val="ListParagraph"/>
+        <w:numPr>
+          <w:ilvl w:val="0"/>
+          <w:numId w:val="2"/>
+        </w:numPr>
+        <w:spacing w:after="90"/>
+      </w:pPr>
+      <w:r>
+        <w:rPr>
+          <w:rFonts w:ascii="Calibri" w:eastAsia="Calibri" w:hAnsi="Calibri" w:cs="Calibri"/>
+        </w:rPr>
+        <w:t xml:space="preserve">Acted as principal adviser to the Senior Leadership Group on IT strategy, technology risk, cyber security, systems investment, supplier performance and digital transformation, turning technical issues into clear, practical advice for non-technical colleagues.</w:t>
+      </w:r>
+    </w:p>
+    <w:p>
+      <w:pPr>
+        <w:pStyle w:val="ListParagraph"/>
+        <w:numPr>
+          <w:ilvl w:val="0"/>
+          <w:numId w:val="2"/>
+        </w:numPr>
+        <w:spacing w:after="90"/>
+      </w:pPr>
+      <w:r>
+        <w:rPr>
+          <w:rFonts w:ascii="Calibri" w:eastAsia="Calibri" w:hAnsi="Calibri" w:cs="Calibri"/>
+        </w:rPr>
+        <w:t xml:space="preserve">Developed a clear, prioritised and affordable technology roadmap, linked directly to organisational strategy and operating model change, and translated Target Operating Model design decisions into practical technology requirements.</w:t>
+      </w:r>
+    </w:p>
+    <w:p>
+      <w:pPr>
+        <w:pStyle w:val="ListParagraph"/>
+        <w:numPr>
+          <w:ilvl w:val="0"/>
+          <w:numId w:val="2"/>
+        </w:numPr>
+        <w:spacing w:after="90"/>
+      </w:pPr>
+      <w:r>
+        <w:rPr>
+          <w:rFonts w:ascii="Calibri" w:eastAsia="Calibri" w:hAnsi="Calibri" w:cs="Calibri"/>
+        </w:rPr>
+        <w:t xml:space="preserve">Set practical principles and guardrails for the responsible use of AI, automation and emerging technologies, and assessed where digital tools, data and AI-enabled solutions could improve IT and day-to-day operations, including building staff digital skills.</w:t>
+      </w:r>
+    </w:p>
+    <w:p>
+      <w:pPr>
+        <w:pStyle w:val="ListParagraph"/>
+        <w:numPr>
+          <w:ilvl w:val="0"/>
+          <w:numId w:val="2"/>
+        </w:numPr>
+        <w:spacing w:after="90"/>
+      </w:pPr>
+      <w:r>
+        <w:rPr>
+          <w:rFonts w:ascii="Calibri" w:eastAsia="Calibri" w:hAnsi="Calibri" w:cs="Calibri"/>
+        </w:rPr>
+        <w:t xml:space="preserve">Balanced strategy with hands-on oversight of IT service delivery, including core infrastructure, devices, and identity and access management, across Microsoft 365, CRM, finance, HR, learning and fundraising systems.</w:t>
+      </w:r>
+    </w:p>
+    <w:p>
+      <w:pPr>
         <w:spacing w:before="200" w:after="20"/>
       </w:pPr>
       <w:r>
@@ -1894,7 +2054,7 @@
         <w:rPr>
           <w:rFonts w:ascii="Calibri" w:eastAsia="Calibri" w:hAnsi="Calibri" w:cs="Calibri"/>
         </w:rPr>
-        <w:t>Manufacturing &amp; Industrial · Professional Services · Renewable Energy &amp; Cleantech · Financial Services · Claims Management · Veterinary Healthcare · Retail · Defence &amp; Aerospace · Property &amp; Real Estate · Social Housing · Gaming &amp; Entertainment</w:t>
+        <w:t xml:space="preserve">Manufacturing &amp; Industrial · Professional Services · Renewable Energy &amp; Cleantech · Financial Services · Claims Management · Veterinary Healthcare · Retail · Defence &amp; Aerospace · Property &amp; Real Estate · Social Housing · Gaming &amp; Entertainment · Charity &amp; Not-for-Profit</w:t>
       </w:r>
     </w:p>
     <w:sectPr>

</xml_diff>